<commit_message>
GA360 multi-channel journeys (RQ1): analysis, site section, paper section 5.2
Co-Authored-By: Claude Opus 5.5 <noreply@anthropic.com>
Claude-Session: https://claude.ai/code/session_019PK2WptsHzXuaQ8ZaQEiDu
</commit_message>
<xml_diff>
--- a/paper/ChannelTrace_Draft_Paper.docx
+++ b/paper/ChannelTrace_Draft_Paper.docx
@@ -367,7 +367,7 @@
           <w:smallCaps w:val="0"/>
           <w:sz w:val="18"/>
         </w:rPr>
-        <w:t>Customers usually interact with several digital channels before buying, yet most businesses judge channels by last-click reports. We study multi-channel attribution and conversion using three public datasets and a known-answer simulation. In 16.5 million Criteo display impressions, only 54.2% of 435,810 conversions that followed a Criteo click were credited to Criteo under the advertiser's last-click rule. Credit was driven by recency: it fell from 87% when the purchase came within an hour of the click to 26% after 7 to 31 days (logistic odds ratio 0.61 per unit of log hours), while additional clicks barely mattered (odds ratio 1.04). In 12,205 e-commerce sessions, new visitors converted at 24.9% against 14.1% for returning visitors, and early-session behaviour predicted purchase with ROC-AUC 0.78. A simulation with known channel effects showed that no attribution model is best everywhere: last touch was most accurate when advertising acts immediately (4.2 percentage points mean error) and time decay when it acts with carry-over (5.7 points), while first touch was worst in both. We release ChannelTrace, a free tool that applies seven attribution models to a business's own Google Ads, Meta Ads or journey data and explains the results through a grounded AI assistant.</w:t>
+        <w:t>Customers usually interact with several digital channels before buying, yet most businesses judge channels by last-click reports. We study multi-channel attribution and conversion using four public datasets and a known-answer simulation. In 16.5 million Criteo display impressions, only 54.2% of 435,810 conversions that followed a Criteo click were credited to Criteo under the advertiser's last-click rule. Credit was driven by recency: it fell from 87% when the purchase came within an hour of the click to 26% after 7 to 31 days (logistic odds ratio 0.61 per unit of log hours), while additional clicks barely mattered (odds ratio 1.04). In 10,022 real Google Analytics 360 journeys, 52% of buyers returned over several sessions but only 12% used more than one channel; within those, first and last touch disagreed sharply (Direct 42% against 1% of the credit). In 12,205 e-commerce sessions, new visitors converted at 24.9% against 14.1% for returning visitors, and early-session behaviour predicted purchase with ROC-AUC 0.78. A simulation with known channel effects showed that no attribution model is best everywhere: last touch was most accurate when advertising acts immediately (4.2 percentage points mean error) and time decay when it acts with carry-over (5.7 points), while first touch was worst in both. We release ChannelTrace, a free tool that applies seven attribution models to a business's own Google Ads, Meta Ads or journey data and explains the results through a grounded AI assistant.</w:t>
       </w:r>
     </w:p>
     <w:p>
@@ -488,7 +488,7 @@
           <w:smallCaps w:val="0"/>
           <w:sz w:val="20"/>
         </w:rPr>
-        <w:t>Our contributions are: (i) evidence from 16.5 million real display impressions that last-click credit is governed mainly by recency; (ii) a known-answer simulation showing that the most accurate attribution model depends on how advertising works, which argues for comparing models rather than choosing one; (iii) an analysis of session behaviour associated with purchase; and (iv) ChannelTrace, an open, zero-cost tool that implements the methods for any business's data.</w:t>
+        <w:t>Our contributions are: (i) evidence from 16.5 million real display impressions that last-click credit is governed mainly by recency; (ii) a cross-session analysis of real multi-channel journeys showing where attribution models disagree; (iii) a known-answer simulation showing that the most accurate attribution model depends on how advertising works, which argues for comparing models rather than choosing one; (iv) an analysis of session behaviour associated with purchase; and (v) ChannelTrace, an open, zero-cost tool that implements the methods for any business's data.</w:t>
       </w:r>
     </w:p>
     <w:p>
@@ -903,7 +903,7 @@
                 <w:b w:val="0"/>
                 <w:sz w:val="16"/>
               </w:rPr>
-              <w:t>12 months of Google Merchandise Store sessions with named channels</w:t>
+              <w:t>903,653 sessions, 714,167 visitors, named channels, 12 months</w:t>
             </w:r>
           </w:p>
         </w:tc>
@@ -922,7 +922,7 @@
                 <w:b w:val="0"/>
                 <w:sz w:val="16"/>
               </w:rPr>
-              <w:t>RQ1, RQ3 (in progress)</w:t>
+              <w:t>RQ1, RQ3</w:t>
             </w:r>
           </w:p>
         </w:tc>
@@ -1696,7 +1696,1122 @@
           <w:smallCaps w:val="0"/>
           <w:sz w:val="20"/>
         </w:rPr>
-        <w:t>B. No Attribution Model Is Best Everywhere (RQ3)</w:t>
+        <w:t>B. Real Multi-Channel Journeys (RQ1, RQ3)</w:t>
+      </w:r>
+    </w:p>
+    <w:p>
+      <w:pPr>
+        <w:spacing w:after="0" w:before="0" w:line="240" w:lineRule="auto"/>
+        <w:ind w:firstLine="202"/>
+        <w:jc w:val="both"/>
+      </w:pPr>
+      <w:r>
+        <w:rPr>
+          <w:rFonts w:ascii="Times New Roman" w:hAnsi="Times New Roman"/>
+          <w:b w:val="0"/>
+          <w:i w:val="0"/>
+          <w:smallCaps w:val="0"/>
+          <w:sz w:val="20"/>
+        </w:rPr>
+        <w:t>The Google Analytics 360 sample covers 714,167 visitors and 903,653 sessions of the Google Merchandise Store over one year. Following each visitor across sessions up to the first purchase gives 10,022 converting journeys (1.4% of all journeys). Buying took repeated visits: 52% of converting journeys spanned more than one session (mean 2.28 sessions, against 1.23 for journeys without a purchase), yet only 12% involved more than one channel. Most customers returned through the channel that first brought them.</w:t>
+      </w:r>
+    </w:p>
+    <w:p>
+      <w:pPr>
+        <w:keepNext/>
+        <w:spacing w:after="0" w:before="120" w:line="240" w:lineRule="auto"/>
+        <w:jc w:val="center"/>
+      </w:pPr>
+      <w:r>
+        <w:rPr>
+          <w:rFonts w:ascii="Times New Roman" w:hAnsi="Times New Roman"/>
+          <w:b w:val="0"/>
+          <w:i w:val="0"/>
+          <w:smallCaps/>
+          <w:sz w:val="16"/>
+        </w:rPr>
+        <w:t>Table III</w:t>
+      </w:r>
+    </w:p>
+    <w:p>
+      <w:pPr>
+        <w:keepNext/>
+        <w:spacing w:after="60" w:before="0" w:line="240" w:lineRule="auto"/>
+        <w:jc w:val="center"/>
+      </w:pPr>
+      <w:r>
+        <w:rPr>
+          <w:rFonts w:ascii="Times New Roman" w:hAnsi="Times New Roman"/>
+          <w:b w:val="0"/>
+          <w:i w:val="0"/>
+          <w:smallCaps/>
+          <w:sz w:val="16"/>
+        </w:rPr>
+        <w:t>Credit Share by Channel, All Converting Journeys (GA360)</w:t>
+      </w:r>
+    </w:p>
+    <w:tbl>
+      <w:tblPr>
+        <w:tblW w:type="auto" w:w="0"/>
+        <w:jc w:val="center"/>
+        <w:tblLayout w:type="fixed"/>
+        <w:tblLook w:firstColumn="1" w:firstRow="1" w:lastColumn="0" w:lastRow="0" w:noHBand="0" w:noVBand="1" w:val="04A0"/>
+        <w:tblBorders>
+          <w:top w:val="single" w:sz="8" w:color="000000"/>
+          <w:bottom w:val="single" w:sz="8" w:color="000000"/>
+          <w:insideH w:val="single" w:sz="2" w:color="000000"/>
+        </w:tblBorders>
+      </w:tblPr>
+      <w:tblGrid>
+        <w:gridCol w:w="1740"/>
+        <w:gridCol w:w="1740"/>
+        <w:gridCol w:w="1740"/>
+        <w:gridCol w:w="1740"/>
+        <w:gridCol w:w="1740"/>
+        <w:gridCol w:w="1740"/>
+      </w:tblGrid>
+      <w:tr>
+        <w:tc>
+          <w:tcPr>
+            <w:tcW w:type="dxa" w:w="1325"/>
+          </w:tcPr>
+          <w:p>
+            <w:pPr>
+              <w:jc w:val="left"/>
+            </w:pPr>
+            <w:r/>
+            <w:r>
+              <w:rPr>
+                <w:rFonts w:ascii="Times New Roman" w:hAnsi="Times New Roman"/>
+                <w:b/>
+                <w:sz w:val="16"/>
+              </w:rPr>
+              <w:t>Channel</w:t>
+            </w:r>
+          </w:p>
+        </w:tc>
+        <w:tc>
+          <w:tcPr>
+            <w:tcW w:type="dxa" w:w="691"/>
+          </w:tcPr>
+          <w:p>
+            <w:pPr>
+              <w:jc w:val="right"/>
+            </w:pPr>
+            <w:r/>
+            <w:r>
+              <w:rPr>
+                <w:rFonts w:ascii="Times New Roman" w:hAnsi="Times New Roman"/>
+                <w:b/>
+                <w:sz w:val="16"/>
+              </w:rPr>
+              <w:t>First</w:t>
+            </w:r>
+          </w:p>
+        </w:tc>
+        <w:tc>
+          <w:tcPr>
+            <w:tcW w:type="dxa" w:w="691"/>
+          </w:tcPr>
+          <w:p>
+            <w:pPr>
+              <w:jc w:val="right"/>
+            </w:pPr>
+            <w:r/>
+            <w:r>
+              <w:rPr>
+                <w:rFonts w:ascii="Times New Roman" w:hAnsi="Times New Roman"/>
+                <w:b/>
+                <w:sz w:val="16"/>
+              </w:rPr>
+              <w:t>Last</w:t>
+            </w:r>
+          </w:p>
+        </w:tc>
+        <w:tc>
+          <w:tcPr>
+            <w:tcW w:type="dxa" w:w="691"/>
+          </w:tcPr>
+          <w:p>
+            <w:pPr>
+              <w:jc w:val="right"/>
+            </w:pPr>
+            <w:r/>
+            <w:r>
+              <w:rPr>
+                <w:rFonts w:ascii="Times New Roman" w:hAnsi="Times New Roman"/>
+                <w:b/>
+                <w:sz w:val="16"/>
+              </w:rPr>
+              <w:t>Linear</w:t>
+            </w:r>
+          </w:p>
+        </w:tc>
+        <w:tc>
+          <w:tcPr>
+            <w:tcW w:type="dxa" w:w="806"/>
+          </w:tcPr>
+          <w:p>
+            <w:pPr>
+              <w:jc w:val="right"/>
+            </w:pPr>
+            <w:r/>
+            <w:r>
+              <w:rPr>
+                <w:rFonts w:ascii="Times New Roman" w:hAnsi="Times New Roman"/>
+                <w:b/>
+                <w:sz w:val="16"/>
+              </w:rPr>
+              <w:t>Markov</w:t>
+            </w:r>
+          </w:p>
+        </w:tc>
+        <w:tc>
+          <w:tcPr>
+            <w:tcW w:type="dxa" w:w="835"/>
+          </w:tcPr>
+          <w:p>
+            <w:pPr>
+              <w:jc w:val="right"/>
+            </w:pPr>
+            <w:r/>
+            <w:r>
+              <w:rPr>
+                <w:rFonts w:ascii="Times New Roman" w:hAnsi="Times New Roman"/>
+                <w:b/>
+                <w:sz w:val="16"/>
+              </w:rPr>
+              <w:t>Shapley</w:t>
+            </w:r>
+          </w:p>
+        </w:tc>
+      </w:tr>
+      <w:tr>
+        <w:tc>
+          <w:tcPr>
+            <w:tcW w:type="dxa" w:w="1325"/>
+          </w:tcPr>
+          <w:p>
+            <w:pPr>
+              <w:jc w:val="left"/>
+            </w:pPr>
+            <w:r/>
+            <w:r>
+              <w:rPr>
+                <w:rFonts w:ascii="Times New Roman" w:hAnsi="Times New Roman"/>
+                <w:b w:val="0"/>
+                <w:sz w:val="16"/>
+              </w:rPr>
+              <w:t>Referral</w:t>
+            </w:r>
+          </w:p>
+        </w:tc>
+        <w:tc>
+          <w:tcPr>
+            <w:tcW w:type="dxa" w:w="691"/>
+          </w:tcPr>
+          <w:p>
+            <w:pPr>
+              <w:jc w:val="right"/>
+            </w:pPr>
+            <w:r/>
+            <w:r>
+              <w:rPr>
+                <w:rFonts w:ascii="Times New Roman" w:hAnsi="Times New Roman"/>
+                <w:b w:val="0"/>
+                <w:sz w:val="16"/>
+              </w:rPr>
+              <w:t>39.9%</w:t>
+            </w:r>
+          </w:p>
+        </w:tc>
+        <w:tc>
+          <w:tcPr>
+            <w:tcW w:type="dxa" w:w="691"/>
+          </w:tcPr>
+          <w:p>
+            <w:pPr>
+              <w:jc w:val="right"/>
+            </w:pPr>
+            <w:r/>
+            <w:r>
+              <w:rPr>
+                <w:rFonts w:ascii="Times New Roman" w:hAnsi="Times New Roman"/>
+                <w:b w:val="0"/>
+                <w:sz w:val="16"/>
+              </w:rPr>
+              <w:t>45.5%</w:t>
+            </w:r>
+          </w:p>
+        </w:tc>
+        <w:tc>
+          <w:tcPr>
+            <w:tcW w:type="dxa" w:w="691"/>
+          </w:tcPr>
+          <w:p>
+            <w:pPr>
+              <w:jc w:val="right"/>
+            </w:pPr>
+            <w:r/>
+            <w:r>
+              <w:rPr>
+                <w:rFonts w:ascii="Times New Roman" w:hAnsi="Times New Roman"/>
+                <w:b w:val="0"/>
+                <w:sz w:val="16"/>
+              </w:rPr>
+              <w:t>42.8%</w:t>
+            </w:r>
+          </w:p>
+        </w:tc>
+        <w:tc>
+          <w:tcPr>
+            <w:tcW w:type="dxa" w:w="806"/>
+          </w:tcPr>
+          <w:p>
+            <w:pPr>
+              <w:jc w:val="right"/>
+            </w:pPr>
+            <w:r/>
+            <w:r>
+              <w:rPr>
+                <w:rFonts w:ascii="Times New Roman" w:hAnsi="Times New Roman"/>
+                <w:b w:val="0"/>
+                <w:sz w:val="16"/>
+              </w:rPr>
+              <w:t>42.5%</w:t>
+            </w:r>
+          </w:p>
+        </w:tc>
+        <w:tc>
+          <w:tcPr>
+            <w:tcW w:type="dxa" w:w="835"/>
+          </w:tcPr>
+          <w:p>
+            <w:pPr>
+              <w:jc w:val="right"/>
+            </w:pPr>
+            <w:r/>
+            <w:r>
+              <w:rPr>
+                <w:rFonts w:ascii="Times New Roman" w:hAnsi="Times New Roman"/>
+                <w:b w:val="0"/>
+                <w:sz w:val="16"/>
+              </w:rPr>
+              <w:t>42.4%</w:t>
+            </w:r>
+          </w:p>
+        </w:tc>
+      </w:tr>
+      <w:tr>
+        <w:tc>
+          <w:tcPr>
+            <w:tcW w:type="dxa" w:w="1325"/>
+          </w:tcPr>
+          <w:p>
+            <w:pPr>
+              <w:jc w:val="left"/>
+            </w:pPr>
+            <w:r/>
+            <w:r>
+              <w:rPr>
+                <w:rFonts w:ascii="Times New Roman" w:hAnsi="Times New Roman"/>
+                <w:b w:val="0"/>
+                <w:sz w:val="16"/>
+              </w:rPr>
+              <w:t>Organic Search</w:t>
+            </w:r>
+          </w:p>
+        </w:tc>
+        <w:tc>
+          <w:tcPr>
+            <w:tcW w:type="dxa" w:w="691"/>
+          </w:tcPr>
+          <w:p>
+            <w:pPr>
+              <w:jc w:val="right"/>
+            </w:pPr>
+            <w:r/>
+            <w:r>
+              <w:rPr>
+                <w:rFonts w:ascii="Times New Roman" w:hAnsi="Times New Roman"/>
+                <w:b w:val="0"/>
+                <w:sz w:val="16"/>
+              </w:rPr>
+              <w:t>31.5%</w:t>
+            </w:r>
+          </w:p>
+        </w:tc>
+        <w:tc>
+          <w:tcPr>
+            <w:tcW w:type="dxa" w:w="691"/>
+          </w:tcPr>
+          <w:p>
+            <w:pPr>
+              <w:jc w:val="right"/>
+            </w:pPr>
+            <w:r/>
+            <w:r>
+              <w:rPr>
+                <w:rFonts w:ascii="Times New Roman" w:hAnsi="Times New Roman"/>
+                <w:b w:val="0"/>
+                <w:sz w:val="16"/>
+              </w:rPr>
+              <w:t>31.1%</w:t>
+            </w:r>
+          </w:p>
+        </w:tc>
+        <w:tc>
+          <w:tcPr>
+            <w:tcW w:type="dxa" w:w="691"/>
+          </w:tcPr>
+          <w:p>
+            <w:pPr>
+              <w:jc w:val="right"/>
+            </w:pPr>
+            <w:r/>
+            <w:r>
+              <w:rPr>
+                <w:rFonts w:ascii="Times New Roman" w:hAnsi="Times New Roman"/>
+                <w:b w:val="0"/>
+                <w:sz w:val="16"/>
+              </w:rPr>
+              <w:t>31.4%</w:t>
+            </w:r>
+          </w:p>
+        </w:tc>
+        <w:tc>
+          <w:tcPr>
+            <w:tcW w:type="dxa" w:w="806"/>
+          </w:tcPr>
+          <w:p>
+            <w:pPr>
+              <w:jc w:val="right"/>
+            </w:pPr>
+            <w:r/>
+            <w:r>
+              <w:rPr>
+                <w:rFonts w:ascii="Times New Roman" w:hAnsi="Times New Roman"/>
+                <w:b w:val="0"/>
+                <w:sz w:val="16"/>
+              </w:rPr>
+              <w:t>32.0%</w:t>
+            </w:r>
+          </w:p>
+        </w:tc>
+        <w:tc>
+          <w:tcPr>
+            <w:tcW w:type="dxa" w:w="835"/>
+          </w:tcPr>
+          <w:p>
+            <w:pPr>
+              <w:jc w:val="right"/>
+            </w:pPr>
+            <w:r/>
+            <w:r>
+              <w:rPr>
+                <w:rFonts w:ascii="Times New Roman" w:hAnsi="Times New Roman"/>
+                <w:b w:val="0"/>
+                <w:sz w:val="16"/>
+              </w:rPr>
+              <w:t>31.3%</w:t>
+            </w:r>
+          </w:p>
+        </w:tc>
+      </w:tr>
+      <w:tr>
+        <w:tc>
+          <w:tcPr>
+            <w:tcW w:type="dxa" w:w="1325"/>
+          </w:tcPr>
+          <w:p>
+            <w:pPr>
+              <w:jc w:val="left"/>
+            </w:pPr>
+            <w:r/>
+            <w:r>
+              <w:rPr>
+                <w:rFonts w:ascii="Times New Roman" w:hAnsi="Times New Roman"/>
+                <w:b w:val="0"/>
+                <w:sz w:val="16"/>
+              </w:rPr>
+              <w:t>Direct</w:t>
+            </w:r>
+          </w:p>
+        </w:tc>
+        <w:tc>
+          <w:tcPr>
+            <w:tcW w:type="dxa" w:w="691"/>
+          </w:tcPr>
+          <w:p>
+            <w:pPr>
+              <w:jc w:val="right"/>
+            </w:pPr>
+            <w:r/>
+            <w:r>
+              <w:rPr>
+                <w:rFonts w:ascii="Times New Roman" w:hAnsi="Times New Roman"/>
+                <w:b w:val="0"/>
+                <w:sz w:val="16"/>
+              </w:rPr>
+              <w:t>22.0%</w:t>
+            </w:r>
+          </w:p>
+        </w:tc>
+        <w:tc>
+          <w:tcPr>
+            <w:tcW w:type="dxa" w:w="691"/>
+          </w:tcPr>
+          <w:p>
+            <w:pPr>
+              <w:jc w:val="right"/>
+            </w:pPr>
+            <w:r/>
+            <w:r>
+              <w:rPr>
+                <w:rFonts w:ascii="Times New Roman" w:hAnsi="Times New Roman"/>
+                <w:b w:val="0"/>
+                <w:sz w:val="16"/>
+              </w:rPr>
+              <w:t>17.1%</w:t>
+            </w:r>
+          </w:p>
+        </w:tc>
+        <w:tc>
+          <w:tcPr>
+            <w:tcW w:type="dxa" w:w="691"/>
+          </w:tcPr>
+          <w:p>
+            <w:pPr>
+              <w:jc w:val="right"/>
+            </w:pPr>
+            <w:r/>
+            <w:r>
+              <w:rPr>
+                <w:rFonts w:ascii="Times New Roman" w:hAnsi="Times New Roman"/>
+                <w:b w:val="0"/>
+                <w:sz w:val="16"/>
+              </w:rPr>
+              <w:t>19.2%</w:t>
+            </w:r>
+          </w:p>
+        </w:tc>
+        <w:tc>
+          <w:tcPr>
+            <w:tcW w:type="dxa" w:w="806"/>
+          </w:tcPr>
+          <w:p>
+            <w:pPr>
+              <w:jc w:val="right"/>
+            </w:pPr>
+            <w:r/>
+            <w:r>
+              <w:rPr>
+                <w:rFonts w:ascii="Times New Roman" w:hAnsi="Times New Roman"/>
+                <w:b w:val="0"/>
+                <w:sz w:val="16"/>
+              </w:rPr>
+              <w:t>18.2%</w:t>
+            </w:r>
+          </w:p>
+        </w:tc>
+        <w:tc>
+          <w:tcPr>
+            <w:tcW w:type="dxa" w:w="835"/>
+          </w:tcPr>
+          <w:p>
+            <w:pPr>
+              <w:jc w:val="right"/>
+            </w:pPr>
+            <w:r/>
+            <w:r>
+              <w:rPr>
+                <w:rFonts w:ascii="Times New Roman" w:hAnsi="Times New Roman"/>
+                <w:b w:val="0"/>
+                <w:sz w:val="16"/>
+              </w:rPr>
+              <w:t>19.5%</w:t>
+            </w:r>
+          </w:p>
+        </w:tc>
+      </w:tr>
+      <w:tr>
+        <w:tc>
+          <w:tcPr>
+            <w:tcW w:type="dxa" w:w="1325"/>
+          </w:tcPr>
+          <w:p>
+            <w:pPr>
+              <w:jc w:val="left"/>
+            </w:pPr>
+            <w:r/>
+            <w:r>
+              <w:rPr>
+                <w:rFonts w:ascii="Times New Roman" w:hAnsi="Times New Roman"/>
+                <w:b w:val="0"/>
+                <w:sz w:val="16"/>
+              </w:rPr>
+              <w:t>Paid Search</w:t>
+            </w:r>
+          </w:p>
+        </w:tc>
+        <w:tc>
+          <w:tcPr>
+            <w:tcW w:type="dxa" w:w="691"/>
+          </w:tcPr>
+          <w:p>
+            <w:pPr>
+              <w:jc w:val="right"/>
+            </w:pPr>
+            <w:r/>
+            <w:r>
+              <w:rPr>
+                <w:rFonts w:ascii="Times New Roman" w:hAnsi="Times New Roman"/>
+                <w:b w:val="0"/>
+                <w:sz w:val="16"/>
+              </w:rPr>
+              <w:t>4.4%</w:t>
+            </w:r>
+          </w:p>
+        </w:tc>
+        <w:tc>
+          <w:tcPr>
+            <w:tcW w:type="dxa" w:w="691"/>
+          </w:tcPr>
+          <w:p>
+            <w:pPr>
+              <w:jc w:val="right"/>
+            </w:pPr>
+            <w:r/>
+            <w:r>
+              <w:rPr>
+                <w:rFonts w:ascii="Times New Roman" w:hAnsi="Times New Roman"/>
+                <w:b w:val="0"/>
+                <w:sz w:val="16"/>
+              </w:rPr>
+              <w:t>4.2%</w:t>
+            </w:r>
+          </w:p>
+        </w:tc>
+        <w:tc>
+          <w:tcPr>
+            <w:tcW w:type="dxa" w:w="691"/>
+          </w:tcPr>
+          <w:p>
+            <w:pPr>
+              <w:jc w:val="right"/>
+            </w:pPr>
+            <w:r/>
+            <w:r>
+              <w:rPr>
+                <w:rFonts w:ascii="Times New Roman" w:hAnsi="Times New Roman"/>
+                <w:b w:val="0"/>
+                <w:sz w:val="16"/>
+              </w:rPr>
+              <w:t>4.3%</w:t>
+            </w:r>
+          </w:p>
+        </w:tc>
+        <w:tc>
+          <w:tcPr>
+            <w:tcW w:type="dxa" w:w="806"/>
+          </w:tcPr>
+          <w:p>
+            <w:pPr>
+              <w:jc w:val="right"/>
+            </w:pPr>
+            <w:r/>
+            <w:r>
+              <w:rPr>
+                <w:rFonts w:ascii="Times New Roman" w:hAnsi="Times New Roman"/>
+                <w:b w:val="0"/>
+                <w:sz w:val="16"/>
+              </w:rPr>
+              <w:t>4.3%</w:t>
+            </w:r>
+          </w:p>
+        </w:tc>
+        <w:tc>
+          <w:tcPr>
+            <w:tcW w:type="dxa" w:w="835"/>
+          </w:tcPr>
+          <w:p>
+            <w:pPr>
+              <w:jc w:val="right"/>
+            </w:pPr>
+            <w:r/>
+            <w:r>
+              <w:rPr>
+                <w:rFonts w:ascii="Times New Roman" w:hAnsi="Times New Roman"/>
+                <w:b w:val="0"/>
+                <w:sz w:val="16"/>
+              </w:rPr>
+              <w:t>4.4%</w:t>
+            </w:r>
+          </w:p>
+        </w:tc>
+      </w:tr>
+      <w:tr>
+        <w:tc>
+          <w:tcPr>
+            <w:tcW w:type="dxa" w:w="1325"/>
+          </w:tcPr>
+          <w:p>
+            <w:pPr>
+              <w:jc w:val="left"/>
+            </w:pPr>
+            <w:r/>
+            <w:r>
+              <w:rPr>
+                <w:rFonts w:ascii="Times New Roman" w:hAnsi="Times New Roman"/>
+                <w:b w:val="0"/>
+                <w:sz w:val="16"/>
+              </w:rPr>
+              <w:t>Display</w:t>
+            </w:r>
+          </w:p>
+        </w:tc>
+        <w:tc>
+          <w:tcPr>
+            <w:tcW w:type="dxa" w:w="691"/>
+          </w:tcPr>
+          <w:p>
+            <w:pPr>
+              <w:jc w:val="right"/>
+            </w:pPr>
+            <w:r/>
+            <w:r>
+              <w:rPr>
+                <w:rFonts w:ascii="Times New Roman" w:hAnsi="Times New Roman"/>
+                <w:b w:val="0"/>
+                <w:sz w:val="16"/>
+              </w:rPr>
+              <w:t>1.3%</w:t>
+            </w:r>
+          </w:p>
+        </w:tc>
+        <w:tc>
+          <w:tcPr>
+            <w:tcW w:type="dxa" w:w="691"/>
+          </w:tcPr>
+          <w:p>
+            <w:pPr>
+              <w:jc w:val="right"/>
+            </w:pPr>
+            <w:r/>
+            <w:r>
+              <w:rPr>
+                <w:rFonts w:ascii="Times New Roman" w:hAnsi="Times New Roman"/>
+                <w:b w:val="0"/>
+                <w:sz w:val="16"/>
+              </w:rPr>
+              <w:t>1.1%</w:t>
+            </w:r>
+          </w:p>
+        </w:tc>
+        <w:tc>
+          <w:tcPr>
+            <w:tcW w:type="dxa" w:w="691"/>
+          </w:tcPr>
+          <w:p>
+            <w:pPr>
+              <w:jc w:val="right"/>
+            </w:pPr>
+            <w:r/>
+            <w:r>
+              <w:rPr>
+                <w:rFonts w:ascii="Times New Roman" w:hAnsi="Times New Roman"/>
+                <w:b w:val="0"/>
+                <w:sz w:val="16"/>
+              </w:rPr>
+              <w:t>1.3%</w:t>
+            </w:r>
+          </w:p>
+        </w:tc>
+        <w:tc>
+          <w:tcPr>
+            <w:tcW w:type="dxa" w:w="806"/>
+          </w:tcPr>
+          <w:p>
+            <w:pPr>
+              <w:jc w:val="right"/>
+            </w:pPr>
+            <w:r/>
+            <w:r>
+              <w:rPr>
+                <w:rFonts w:ascii="Times New Roman" w:hAnsi="Times New Roman"/>
+                <w:b w:val="0"/>
+                <w:sz w:val="16"/>
+              </w:rPr>
+              <w:t>1.3%</w:t>
+            </w:r>
+          </w:p>
+        </w:tc>
+        <w:tc>
+          <w:tcPr>
+            <w:tcW w:type="dxa" w:w="835"/>
+          </w:tcPr>
+          <w:p>
+            <w:pPr>
+              <w:jc w:val="right"/>
+            </w:pPr>
+            <w:r/>
+            <w:r>
+              <w:rPr>
+                <w:rFonts w:ascii="Times New Roman" w:hAnsi="Times New Roman"/>
+                <w:b w:val="0"/>
+                <w:sz w:val="16"/>
+              </w:rPr>
+              <w:t>1.3%</w:t>
+            </w:r>
+          </w:p>
+        </w:tc>
+      </w:tr>
+      <w:tr>
+        <w:tc>
+          <w:tcPr>
+            <w:tcW w:type="dxa" w:w="1325"/>
+          </w:tcPr>
+          <w:p>
+            <w:pPr>
+              <w:jc w:val="left"/>
+            </w:pPr>
+            <w:r/>
+            <w:r>
+              <w:rPr>
+                <w:rFonts w:ascii="Times New Roman" w:hAnsi="Times New Roman"/>
+                <w:b w:val="0"/>
+                <w:sz w:val="16"/>
+              </w:rPr>
+              <w:t>Social</w:t>
+            </w:r>
+          </w:p>
+        </w:tc>
+        <w:tc>
+          <w:tcPr>
+            <w:tcW w:type="dxa" w:w="691"/>
+          </w:tcPr>
+          <w:p>
+            <w:pPr>
+              <w:jc w:val="right"/>
+            </w:pPr>
+            <w:r/>
+            <w:r>
+              <w:rPr>
+                <w:rFonts w:ascii="Times New Roman" w:hAnsi="Times New Roman"/>
+                <w:b w:val="0"/>
+                <w:sz w:val="16"/>
+              </w:rPr>
+              <w:t>0.8%</w:t>
+            </w:r>
+          </w:p>
+        </w:tc>
+        <w:tc>
+          <w:tcPr>
+            <w:tcW w:type="dxa" w:w="691"/>
+          </w:tcPr>
+          <w:p>
+            <w:pPr>
+              <w:jc w:val="right"/>
+            </w:pPr>
+            <w:r/>
+            <w:r>
+              <w:rPr>
+                <w:rFonts w:ascii="Times New Roman" w:hAnsi="Times New Roman"/>
+                <w:b w:val="0"/>
+                <w:sz w:val="16"/>
+              </w:rPr>
+              <w:t>1.0%</w:t>
+            </w:r>
+          </w:p>
+        </w:tc>
+        <w:tc>
+          <w:tcPr>
+            <w:tcW w:type="dxa" w:w="691"/>
+          </w:tcPr>
+          <w:p>
+            <w:pPr>
+              <w:jc w:val="right"/>
+            </w:pPr>
+            <w:r/>
+            <w:r>
+              <w:rPr>
+                <w:rFonts w:ascii="Times New Roman" w:hAnsi="Times New Roman"/>
+                <w:b w:val="0"/>
+                <w:sz w:val="16"/>
+              </w:rPr>
+              <w:t>0.9%</w:t>
+            </w:r>
+          </w:p>
+        </w:tc>
+        <w:tc>
+          <w:tcPr>
+            <w:tcW w:type="dxa" w:w="806"/>
+          </w:tcPr>
+          <w:p>
+            <w:pPr>
+              <w:jc w:val="right"/>
+            </w:pPr>
+            <w:r/>
+            <w:r>
+              <w:rPr>
+                <w:rFonts w:ascii="Times New Roman" w:hAnsi="Times New Roman"/>
+                <w:b w:val="0"/>
+                <w:sz w:val="16"/>
+              </w:rPr>
+              <w:t>1.2%</w:t>
+            </w:r>
+          </w:p>
+        </w:tc>
+        <w:tc>
+          <w:tcPr>
+            <w:tcW w:type="dxa" w:w="835"/>
+          </w:tcPr>
+          <w:p>
+            <w:pPr>
+              <w:jc w:val="right"/>
+            </w:pPr>
+            <w:r/>
+            <w:r>
+              <w:rPr>
+                <w:rFonts w:ascii="Times New Roman" w:hAnsi="Times New Roman"/>
+                <w:b w:val="0"/>
+                <w:sz w:val="16"/>
+              </w:rPr>
+              <w:t>0.9%</w:t>
+            </w:r>
+          </w:p>
+        </w:tc>
+      </w:tr>
+      <w:tr>
+        <w:tc>
+          <w:tcPr>
+            <w:tcW w:type="dxa" w:w="1325"/>
+          </w:tcPr>
+          <w:p>
+            <w:pPr>
+              <w:jc w:val="left"/>
+            </w:pPr>
+            <w:r/>
+            <w:r>
+              <w:rPr>
+                <w:rFonts w:ascii="Times New Roman" w:hAnsi="Times New Roman"/>
+                <w:b w:val="0"/>
+                <w:sz w:val="16"/>
+              </w:rPr>
+              <w:t>Affiliates</w:t>
+            </w:r>
+          </w:p>
+        </w:tc>
+        <w:tc>
+          <w:tcPr>
+            <w:tcW w:type="dxa" w:w="691"/>
+          </w:tcPr>
+          <w:p>
+            <w:pPr>
+              <w:jc w:val="right"/>
+            </w:pPr>
+            <w:r/>
+            <w:r>
+              <w:rPr>
+                <w:rFonts w:ascii="Times New Roman" w:hAnsi="Times New Roman"/>
+                <w:b w:val="0"/>
+                <w:sz w:val="16"/>
+              </w:rPr>
+              <w:t>0.1%</w:t>
+            </w:r>
+          </w:p>
+        </w:tc>
+        <w:tc>
+          <w:tcPr>
+            <w:tcW w:type="dxa" w:w="691"/>
+          </w:tcPr>
+          <w:p>
+            <w:pPr>
+              <w:jc w:val="right"/>
+            </w:pPr>
+            <w:r/>
+            <w:r>
+              <w:rPr>
+                <w:rFonts w:ascii="Times New Roman" w:hAnsi="Times New Roman"/>
+                <w:b w:val="0"/>
+                <w:sz w:val="16"/>
+              </w:rPr>
+              <w:t>0.1%</w:t>
+            </w:r>
+          </w:p>
+        </w:tc>
+        <w:tc>
+          <w:tcPr>
+            <w:tcW w:type="dxa" w:w="691"/>
+          </w:tcPr>
+          <w:p>
+            <w:pPr>
+              <w:jc w:val="right"/>
+            </w:pPr>
+            <w:r/>
+            <w:r>
+              <w:rPr>
+                <w:rFonts w:ascii="Times New Roman" w:hAnsi="Times New Roman"/>
+                <w:b w:val="0"/>
+                <w:sz w:val="16"/>
+              </w:rPr>
+              <w:t>0.1%</w:t>
+            </w:r>
+          </w:p>
+        </w:tc>
+        <w:tc>
+          <w:tcPr>
+            <w:tcW w:type="dxa" w:w="806"/>
+          </w:tcPr>
+          <w:p>
+            <w:pPr>
+              <w:jc w:val="right"/>
+            </w:pPr>
+            <w:r/>
+            <w:r>
+              <w:rPr>
+                <w:rFonts w:ascii="Times New Roman" w:hAnsi="Times New Roman"/>
+                <w:b w:val="0"/>
+                <w:sz w:val="16"/>
+              </w:rPr>
+              <w:t>0.5%</w:t>
+            </w:r>
+          </w:p>
+        </w:tc>
+        <w:tc>
+          <w:tcPr>
+            <w:tcW w:type="dxa" w:w="835"/>
+          </w:tcPr>
+          <w:p>
+            <w:pPr>
+              <w:jc w:val="right"/>
+            </w:pPr>
+            <w:r/>
+            <w:r>
+              <w:rPr>
+                <w:rFonts w:ascii="Times New Roman" w:hAnsi="Times New Roman"/>
+                <w:b w:val="0"/>
+                <w:sz w:val="16"/>
+              </w:rPr>
+              <w:t>0.1%</w:t>
+            </w:r>
+          </w:p>
+        </w:tc>
+      </w:tr>
+    </w:tbl>
+    <w:p>
+      <w:pPr>
+        <w:spacing w:after="80" w:before="0" w:line="240" w:lineRule="auto"/>
+        <w:ind w:firstLine="202"/>
+        <w:jc w:val="both"/>
+      </w:pPr>
+    </w:p>
+    <w:p>
+      <w:pPr>
+        <w:spacing w:after="0" w:before="0" w:line="240" w:lineRule="auto"/>
+        <w:ind w:firstLine="202"/>
+        <w:jc w:val="both"/>
+      </w:pPr>
+      <w:r>
+        <w:rPr>
+          <w:rFonts w:ascii="Times New Roman" w:hAnsi="Times New Roman"/>
+          <w:b w:val="0"/>
+          <w:i w:val="0"/>
+          <w:smallCaps w:val="0"/>
+          <w:sz w:val="20"/>
+        </w:rPr>
+        <w:t>Because so few journeys mix channels, the seven models broadly agree on the whole sample (Table III); the largest swing, for Referral, is from 39.9% to 45.5%. The disagreement is concentrated in the 1,189 multi-channel journeys (Fig. 2). There, first touch gives Direct 42% of the credit and last touch 1%, while Referral moves from 13% to 60%; the most common multi-channel paths were Direct &gt; Referral and Organic Search &gt; Referral. For these customers the choice of model decides which channel is funded.</w:t>
+      </w:r>
+    </w:p>
+    <w:p>
+      <w:pPr>
+        <w:keepNext/>
+        <w:spacing w:before="80"/>
+        <w:jc w:val="center"/>
+      </w:pPr>
+      <w:r>
+        <w:drawing>
+          <wp:inline xmlns:a="http://schemas.openxmlformats.org/drawingml/2006/main" xmlns:pic="http://schemas.openxmlformats.org/drawingml/2006/picture">
+            <wp:extent cx="3200400" cy="2194560"/>
+            <wp:docPr id="2" name="Picture 2"/>
+            <wp:cNvGraphicFramePr>
+              <a:graphicFrameLocks noChangeAspect="1"/>
+            </wp:cNvGraphicFramePr>
+            <a:graphic>
+              <a:graphicData uri="http://schemas.openxmlformats.org/drawingml/2006/picture">
+                <pic:pic>
+                  <pic:nvPicPr>
+                    <pic:cNvPr id="0" name="fig_ga360.png"/>
+                    <pic:cNvPicPr/>
+                  </pic:nvPicPr>
+                  <pic:blipFill>
+                    <a:blip r:embed="rId10"/>
+                    <a:stretch>
+                      <a:fillRect/>
+                    </a:stretch>
+                  </pic:blipFill>
+                  <pic:spPr>
+                    <a:xfrm>
+                      <a:off x="0" y="0"/>
+                      <a:ext cx="3200400" cy="2194560"/>
+                    </a:xfrm>
+                    <a:prstGeom prst="rect"/>
+                  </pic:spPr>
+                </pic:pic>
+              </a:graphicData>
+            </a:graphic>
+          </wp:inline>
+        </w:drawing>
+      </w:r>
+    </w:p>
+    <w:p>
+      <w:pPr>
+        <w:spacing w:after="120" w:before="0" w:line="240" w:lineRule="auto"/>
+        <w:jc w:val="both"/>
+      </w:pPr>
+      <w:r>
+        <w:rPr>
+          <w:rFonts w:ascii="Times New Roman" w:hAnsi="Times New Roman"/>
+          <w:b w:val="0"/>
+          <w:i w:val="0"/>
+          <w:smallCaps w:val="0"/>
+          <w:sz w:val="16"/>
+        </w:rPr>
+        <w:t>Fig. 2.  Credit share by channel within the 1,189 GA360 converting journeys that used more than one channel.</w:t>
+      </w:r>
+    </w:p>
+    <w:p>
+      <w:pPr>
+        <w:spacing w:after="0" w:before="0" w:line="240" w:lineRule="auto"/>
+        <w:ind w:firstLine="202"/>
+        <w:jc w:val="both"/>
+      </w:pPr>
+      <w:r>
+        <w:rPr>
+          <w:rFonts w:ascii="Times New Roman" w:hAnsi="Times New Roman"/>
+          <w:b w:val="0"/>
+          <w:i w:val="0"/>
+          <w:smallCaps w:val="0"/>
+          <w:sz w:val="20"/>
+        </w:rPr>
+        <w:t>Two properties of the data qualify this. Google Analytics labels a returning direct visit with the source of the visitor's previous campaign: 40,356 of the 104,838 Referral sessions are flagged in the data as direct visits. Direct can therefore rarely follow another channel, which mechanically lowers its last-touch share. And 97% of converting Referral sessions record no referring site, so Referral's large share cannot be read as the value of third-party sites.</w:t>
+      </w:r>
+    </w:p>
+    <w:p>
+      <w:pPr>
+        <w:keepNext/>
+        <w:spacing w:after="40" w:before="80" w:line="240" w:lineRule="auto"/>
+        <w:jc w:val="left"/>
+      </w:pPr>
+      <w:r>
+        <w:rPr>
+          <w:rFonts w:ascii="Times New Roman" w:hAnsi="Times New Roman"/>
+          <w:b w:val="0"/>
+          <w:i/>
+          <w:smallCaps w:val="0"/>
+          <w:sz w:val="20"/>
+        </w:rPr>
+        <w:t>C. No Attribution Model Is Best Everywhere (RQ3)</w:t>
       </w:r>
     </w:p>
     <w:p>
@@ -1709,7 +2824,7 @@
         <w:drawing>
           <wp:inline xmlns:a="http://schemas.openxmlformats.org/drawingml/2006/main" xmlns:pic="http://schemas.openxmlformats.org/drawingml/2006/picture">
             <wp:extent cx="3200400" cy="2103120"/>
-            <wp:docPr id="2" name="Picture 2"/>
+            <wp:docPr id="3" name="Picture 3"/>
             <wp:cNvGraphicFramePr>
               <a:graphicFrameLocks noChangeAspect="1"/>
             </wp:cNvGraphicFramePr>
@@ -1721,7 +2836,7 @@
                     <pic:cNvPicPr/>
                   </pic:nvPicPr>
                   <pic:blipFill>
-                    <a:blip r:embed="rId10"/>
+                    <a:blip r:embed="rId11"/>
                     <a:stretch>
                       <a:fillRect/>
                     </a:stretch>
@@ -1753,7 +2868,7 @@
           <w:smallCaps w:val="0"/>
           <w:sz w:val="16"/>
         </w:rPr>
-        <w:t>Fig. 2.  Mean absolute error between model and true credit shares (percentage points; bars show the standard deviation over six worlds).</w:t>
+        <w:t>Fig. 3.  Mean absolute error between model and true credit shares (percentage points; bars show the standard deviation over six worlds).</w:t>
       </w:r>
     </w:p>
     <w:p>
@@ -1770,7 +2885,7 @@
           <w:smallCaps/>
           <w:sz w:val="16"/>
         </w:rPr>
-        <w:t>Table III</w:t>
+        <w:t>Table IV</w:t>
       </w:r>
     </w:p>
     <w:p>
@@ -2620,7 +3735,7 @@
         <w:drawing>
           <wp:inline xmlns:a="http://schemas.openxmlformats.org/drawingml/2006/main" xmlns:pic="http://schemas.openxmlformats.org/drawingml/2006/picture">
             <wp:extent cx="3200400" cy="2103120"/>
-            <wp:docPr id="3" name="Picture 3"/>
+            <wp:docPr id="4" name="Picture 4"/>
             <wp:cNvGraphicFramePr>
               <a:graphicFrameLocks noChangeAspect="1"/>
             </wp:cNvGraphicFramePr>
@@ -2632,7 +3747,7 @@
                     <pic:cNvPicPr/>
                   </pic:nvPicPr>
                   <pic:blipFill>
-                    <a:blip r:embed="rId11"/>
+                    <a:blip r:embed="rId12"/>
                     <a:stretch>
                       <a:fillRect/>
                     </a:stretch>
@@ -2664,7 +3779,7 @@
           <w:smallCaps w:val="0"/>
           <w:sz w:val="16"/>
         </w:rPr>
-        <w:t>Fig. 3.  Last-touch and Markov credit shares with 95% bootstrap intervals on 4,000 synthetic journeys with designed channel roles.</w:t>
+        <w:t>Fig. 4.  Last-touch and Markov credit shares with 95% bootstrap intervals on 4,000 synthetic journeys with designed channel roles.</w:t>
       </w:r>
     </w:p>
     <w:p>
@@ -2698,7 +3813,7 @@
           <w:smallCaps w:val="0"/>
           <w:sz w:val="20"/>
         </w:rPr>
-        <w:t>C. Session Behaviour Associated With Purchase (RQ2, RQ4)</w:t>
+        <w:t>D. Session Behaviour Associated With Purchase (RQ2, RQ4)</w:t>
       </w:r>
     </w:p>
     <w:p>
@@ -2715,7 +3830,7 @@
           <w:smallCaps w:val="0"/>
           <w:sz w:val="20"/>
         </w:rPr>
-        <w:t>The overall conversion rate was 15.6%. New visitors converted at 24.9% against 14.1% for returning visitors, who made up 85% of sessions (chi-square p &lt; 0.001). Conversion peaked in Nov (25.5%) and was lowest in Feb (1.7%; Fig. 4).</w:t>
+        <w:t>The overall conversion rate was 15.6%. New visitors converted at 24.9% against 14.1% for returning visitors, who made up 85% of sessions (chi-square p &lt; 0.001). Conversion peaked in Nov (25.5%) and was lowest in Feb (1.7%; Fig. 5).</w:t>
       </w:r>
     </w:p>
     <w:p>
@@ -2728,7 +3843,7 @@
         <w:drawing>
           <wp:inline xmlns:a="http://schemas.openxmlformats.org/drawingml/2006/main" xmlns:pic="http://schemas.openxmlformats.org/drawingml/2006/picture">
             <wp:extent cx="3200400" cy="1737360"/>
-            <wp:docPr id="4" name="Picture 4"/>
+            <wp:docPr id="5" name="Picture 5"/>
             <wp:cNvGraphicFramePr>
               <a:graphicFrameLocks noChangeAspect="1"/>
             </wp:cNvGraphicFramePr>
@@ -2740,7 +3855,7 @@
                     <pic:cNvPicPr/>
                   </pic:nvPicPr>
                   <pic:blipFill>
-                    <a:blip r:embed="rId12"/>
+                    <a:blip r:embed="rId13"/>
                     <a:stretch>
                       <a:fillRect/>
                     </a:stretch>
@@ -2772,7 +3887,7 @@
           <w:smallCaps w:val="0"/>
           <w:sz w:val="16"/>
         </w:rPr>
-        <w:t>Fig. 4.  Conversion rate by month in the UCI Online Shoppers data (January and April are absent).</w:t>
+        <w:t>Fig. 5.  Conversion rate by month in the UCI Online Shoppers data (January and April are absent).</w:t>
       </w:r>
     </w:p>
     <w:p>
@@ -2789,7 +3904,7 @@
           <w:smallCaps/>
           <w:sz w:val="16"/>
         </w:rPr>
-        <w:t>Table IV</w:t>
+        <w:t>Table V</w:t>
       </w:r>
     </w:p>
     <w:p>
@@ -3395,7 +4510,7 @@
           <w:smallCaps/>
           <w:sz w:val="16"/>
         </w:rPr>
-        <w:t>Table V</w:t>
+        <w:t>Table VI</w:t>
       </w:r>
     </w:p>
     <w:p>
@@ -3690,7 +4805,7 @@
           <w:smallCaps w:val="0"/>
           <w:sz w:val="20"/>
         </w:rPr>
-        <w:t>All ten behavioural measures differed significantly. Buyers viewed a median of 29 product pages against 16 and bounced and exited far less (Table IV). With PageValues the best model reached ROC-AUC 0.932; without it, 0.775, which is the honest estimate of what early-session behaviour reveals. The strongest signals without PageValues were time on product pages, exit rate, the November season (Table V).</w:t>
+        <w:t>All ten behavioural measures differed significantly. Buyers viewed a median of 29 product pages against 16 and bounced and exited far less (Table V). With PageValues the best model reached ROC-AUC 0.932; without it, 0.775, which is the honest estimate of what early-session behaviour reveals. The strongest signals without PageValues were time on product pages, exit rate, the November season (Table VI).</w:t>
       </w:r>
     </w:p>
     <w:p>
@@ -3707,7 +4822,7 @@
           <w:smallCaps w:val="0"/>
           <w:sz w:val="20"/>
         </w:rPr>
-        <w:t>D. Tool Validation on Real Advertising Data (RQ5)</w:t>
+        <w:t>E. Tool Validation on Real Advertising Data (RQ5)</w:t>
       </w:r>
     </w:p>
     <w:p>
@@ -3725,40 +4840,6 @@
           <w:sz w:val="20"/>
         </w:rPr>
         <w:t>ChannelTrace was run on the real Facebook Ad Campaign data. It recognised the export format automatically and reproduced the campaign totals computed independently in Python to the cent (spend 58,705.23; cost per acquisition 54.41). It found that 10.0% of spend went to ad sets with no approved conversions, that the 30-34 age group had the lowest cost per acquisition (30.88 against 99.76 for ages 45-49), and that men converted more cheaply than women (41.44 against 69.70). The browser implementation of all seven attribution models matched the Python reference exactly on the synthetic journeys. A usability study (System Usability Scale [12]) and an accuracy test of the assistant on a fixed question set are planned.</w:t>
-      </w:r>
-    </w:p>
-    <w:p>
-      <w:pPr>
-        <w:keepNext/>
-        <w:spacing w:after="40" w:before="80" w:line="240" w:lineRule="auto"/>
-        <w:jc w:val="left"/>
-      </w:pPr>
-      <w:r>
-        <w:rPr>
-          <w:rFonts w:ascii="Times New Roman" w:hAnsi="Times New Roman"/>
-          <w:b w:val="0"/>
-          <w:i/>
-          <w:smallCaps w:val="0"/>
-          <w:sz w:val="20"/>
-        </w:rPr>
-        <w:t>E. Multi-Session Channel Journeys (RQ1): In Progress</w:t>
-      </w:r>
-    </w:p>
-    <w:p>
-      <w:pPr>
-        <w:spacing w:after="0" w:before="0" w:line="240" w:lineRule="auto"/>
-        <w:ind w:firstLine="202"/>
-        <w:jc w:val="both"/>
-      </w:pPr>
-      <w:r>
-        <w:rPr>
-          <w:rFonts w:ascii="Times New Roman" w:hAnsi="Times New Roman"/>
-          <w:b w:val="0"/>
-          <w:i w:val="0"/>
-          <w:smallCaps w:val="0"/>
-          <w:sz w:val="20"/>
-        </w:rPr>
-        <w:t>The Google Analytics 360 sample is the only public dataset with several named channels per customer across sessions. Its extraction through Google BigQuery is in progress; the journey and attribution comparison on real channels will be reported in the next version of this paper.</w:t>
       </w:r>
     </w:p>
     <w:p>
@@ -3860,6 +4941,23 @@
           <w:smallCaps w:val="0"/>
           <w:sz w:val="20"/>
         </w:rPr>
+        <w:t>The GA360 journeys add a practical nuance. For most of this store's customers the attribution model hardly matters, because they return through the same channel; it matters a great deal for the minority who move between channels, typically arriving directly or through search and buying later through a referral link. A business can check this cheaply: if few of its converting journeys mix channels, last-click reports are roughly adequate; if many do, the models must be compared before budgets are moved.</w:t>
+      </w:r>
+    </w:p>
+    <w:p>
+      <w:pPr>
+        <w:spacing w:after="0" w:before="0" w:line="240" w:lineRule="auto"/>
+        <w:ind w:firstLine="202"/>
+        <w:jc w:val="both"/>
+      </w:pPr>
+      <w:r>
+        <w:rPr>
+          <w:rFonts w:ascii="Times New Roman" w:hAnsi="Times New Roman"/>
+          <w:b w:val="0"/>
+          <w:i w:val="0"/>
+          <w:smallCaps w:val="0"/>
+          <w:sz w:val="20"/>
+        </w:rPr>
         <w:t>For marketers the session results suggest three practical actions: re-engage returning visitors, who are most of the traffic but convert least; concentrate budget before the seasonal peak; and send paid traffic directly to product pages, where depth of browsing is the strongest early signal of purchase intent.</w:t>
       </w:r>
     </w:p>
@@ -3894,7 +4992,7 @@
           <w:smallCaps w:val="0"/>
           <w:sz w:val="20"/>
         </w:rPr>
-        <w:t>All findings are associations. Attribution assigns credit and does not establish that a channel caused a sale; only randomised experiments can do that. The Criteo sample covers one channel and retains only clicked impressions for converting users, so view-through effects cannot be studied. The UCI traffic sources are anonymised. The simulation uses two stylised mechanisms and six worlds each; other mechanisms may favour other models. The GA360 journey analysis, a usability study with 8 to 10 users and an accuracy evaluation of the assistant are the next steps.</w:t>
+        <w:t>All findings are associations. Attribution assigns credit and does not establish that a channel caused a sale; only randomised experiments can do that. The Criteo sample covers one channel and retains only clicked impressions for converting users, so view-through effects cannot be studied. The UCI traffic sources are anonymised. The simulation uses two stylised mechanisms and six worlds each; other mechanisms may favour other models. The GA360 sample is one store, uses Google Analytics' own channel definitions and links sessions only through a cookie-based visitor ID, so journeys across devices are split. A usability study of the tool and an accuracy evaluation of the assistant are the next steps.</w:t>
       </w:r>
     </w:p>
     <w:p>
@@ -3928,7 +5026,7 @@
           <w:smallCaps w:val="0"/>
           <w:sz w:val="20"/>
         </w:rPr>
-        <w:t>Using public data at scale and a simulation with known answers, we found that last-click credit is governed mainly by recency and that the most accurate attribution model depends on how advertising works. Businesses should therefore compare attribution models rather than trust any single report. ChannelTrace makes that comparison free and accessible, together with plain-language explanations of the results.</w:t>
+        <w:t>Using public data at scale and a simulation with known answers, we found that last-click credit is governed mainly by recency, that attribution models disagree mainly on the customers who move between channels, and that the most accurate attribution model depends on how advertising works. Businesses should therefore compare attribution models rather than trust any single report. ChannelTrace makes that comparison free and accessible, together with plain-language explanations of the results.</w:t>
       </w:r>
     </w:p>
     <w:p>
@@ -3989,7 +5087,7 @@
         </w:tabs>
         <w:spacing w:after="40" w:before="0" w:line="240" w:lineRule="auto"/>
         <w:ind w:left="432" w:hanging="432"/>
-        <w:jc w:val="both"/>
+        <w:jc w:val="left"/>
       </w:pPr>
       <w:r>
         <w:rPr>
@@ -4040,7 +5138,7 @@
         </w:tabs>
         <w:spacing w:after="40" w:before="0" w:line="240" w:lineRule="auto"/>
         <w:ind w:left="432" w:hanging="432"/>
-        <w:jc w:val="both"/>
+        <w:jc w:val="left"/>
       </w:pPr>
       <w:r>
         <w:rPr>
@@ -4091,7 +5189,7 @@
         </w:tabs>
         <w:spacing w:after="40" w:before="0" w:line="240" w:lineRule="auto"/>
         <w:ind w:left="432" w:hanging="432"/>
-        <w:jc w:val="both"/>
+        <w:jc w:val="left"/>
       </w:pPr>
       <w:r>
         <w:rPr>
@@ -4142,7 +5240,7 @@
         </w:tabs>
         <w:spacing w:after="40" w:before="0" w:line="240" w:lineRule="auto"/>
         <w:ind w:left="432" w:hanging="432"/>
-        <w:jc w:val="both"/>
+        <w:jc w:val="left"/>
       </w:pPr>
       <w:r>
         <w:rPr>
@@ -4193,7 +5291,7 @@
         </w:tabs>
         <w:spacing w:after="40" w:before="0" w:line="240" w:lineRule="auto"/>
         <w:ind w:left="432" w:hanging="432"/>
-        <w:jc w:val="both"/>
+        <w:jc w:val="left"/>
       </w:pPr>
       <w:r>
         <w:rPr>
@@ -4244,7 +5342,7 @@
         </w:tabs>
         <w:spacing w:after="40" w:before="0" w:line="240" w:lineRule="auto"/>
         <w:ind w:left="432" w:hanging="432"/>
-        <w:jc w:val="both"/>
+        <w:jc w:val="left"/>
       </w:pPr>
       <w:r>
         <w:rPr>
@@ -4295,7 +5393,7 @@
         </w:tabs>
         <w:spacing w:after="40" w:before="0" w:line="240" w:lineRule="auto"/>
         <w:ind w:left="432" w:hanging="432"/>
-        <w:jc w:val="both"/>
+        <w:jc w:val="left"/>
       </w:pPr>
       <w:r>
         <w:rPr>
@@ -4326,7 +5424,7 @@
         </w:tabs>
         <w:spacing w:after="40" w:before="0" w:line="240" w:lineRule="auto"/>
         <w:ind w:left="432" w:hanging="432"/>
-        <w:jc w:val="both"/>
+        <w:jc w:val="left"/>
       </w:pPr>
       <w:r>
         <w:rPr>
@@ -4377,7 +5475,7 @@
         </w:tabs>
         <w:spacing w:after="40" w:before="0" w:line="240" w:lineRule="auto"/>
         <w:ind w:left="432" w:hanging="432"/>
-        <w:jc w:val="both"/>
+        <w:jc w:val="left"/>
       </w:pPr>
       <w:r>
         <w:rPr>
@@ -4428,7 +5526,7 @@
         </w:tabs>
         <w:spacing w:after="40" w:before="0" w:line="240" w:lineRule="auto"/>
         <w:ind w:left="432" w:hanging="432"/>
-        <w:jc w:val="both"/>
+        <w:jc w:val="left"/>
       </w:pPr>
       <w:r>
         <w:rPr>
@@ -4459,7 +5557,7 @@
         </w:tabs>
         <w:spacing w:after="40" w:before="0" w:line="240" w:lineRule="auto"/>
         <w:ind w:left="432" w:hanging="432"/>
-        <w:jc w:val="both"/>
+        <w:jc w:val="left"/>
       </w:pPr>
       <w:r>
         <w:rPr>
@@ -4490,7 +5588,7 @@
         </w:tabs>
         <w:spacing w:after="40" w:before="0" w:line="240" w:lineRule="auto"/>
         <w:ind w:left="432" w:hanging="432"/>
-        <w:jc w:val="both"/>
+        <w:jc w:val="left"/>
       </w:pPr>
       <w:r>
         <w:rPr>

</xml_diff>

<commit_message>
Fill in authors, guide and team emails in paper, synopsis and deck
Co-Authored-By: Claude Opus 5.5 <noreply@anthropic.com>
Claude-Session: https://claude.ai/code/session_019PK2WptsHzXuaQ8ZaQEiDu
</commit_message>
<xml_diff>
--- a/paper/ChannelTrace_Draft_Paper.docx
+++ b/paper/ChannelTrace_Draft_Paper.docx
@@ -25,15 +25,14 @@
         <w:tblLook w:firstColumn="1" w:firstRow="1" w:lastColumn="0" w:lastRow="0" w:noHBand="0" w:noVBand="1" w:val="04A0"/>
       </w:tblPr>
       <w:tblGrid>
-        <w:gridCol w:w="2610"/>
-        <w:gridCol w:w="2610"/>
-        <w:gridCol w:w="2610"/>
-        <w:gridCol w:w="2610"/>
+        <w:gridCol w:w="3480"/>
+        <w:gridCol w:w="3480"/>
+        <w:gridCol w:w="3480"/>
       </w:tblGrid>
       <w:tr>
         <w:tc>
           <w:tcPr>
-            <w:tcW w:type="dxa" w:w="2610"/>
+            <w:tcW w:type="dxa" w:w="3312"/>
           </w:tcPr>
           <w:p>
             <w:pPr>
@@ -46,20 +45,7 @@
                 <w:i w:val="0"/>
                 <w:sz w:val="22"/>
               </w:rPr>
-              <w:t>[Author 1]</w:t>
-            </w:r>
-          </w:p>
-          <w:p>
-            <w:pPr>
-              <w:jc w:val="center"/>
-            </w:pPr>
-            <w:r>
-              <w:rPr>
-                <w:rFonts w:ascii="Times New Roman" w:hAnsi="Times New Roman"/>
-                <w:i/>
-                <w:sz w:val="18"/>
-              </w:rPr>
-              <w:t>Dept. of [Department]</w:t>
+              <w:t>Nishaad Gangal</w:t>
             </w:r>
           </w:p>
           <w:p>
@@ -98,13 +84,13 @@
                 <w:i w:val="0"/>
                 <w:sz w:val="18"/>
               </w:rPr>
-              <w:t>[email]</w:t>
+              <w:t>nishaad.gangal23@pccoepune.org</w:t>
             </w:r>
           </w:p>
         </w:tc>
         <w:tc>
           <w:tcPr>
-            <w:tcW w:type="dxa" w:w="2610"/>
+            <w:tcW w:type="dxa" w:w="3312"/>
           </w:tcPr>
           <w:p>
             <w:pPr>
@@ -117,20 +103,7 @@
                 <w:i w:val="0"/>
                 <w:sz w:val="22"/>
               </w:rPr>
-              <w:t>[Author 2]</w:t>
-            </w:r>
-          </w:p>
-          <w:p>
-            <w:pPr>
-              <w:jc w:val="center"/>
-            </w:pPr>
-            <w:r>
-              <w:rPr>
-                <w:rFonts w:ascii="Times New Roman" w:hAnsi="Times New Roman"/>
-                <w:i/>
-                <w:sz w:val="18"/>
-              </w:rPr>
-              <w:t>Dept. of [Department]</w:t>
+              <w:t>Om Katole</w:t>
             </w:r>
           </w:p>
           <w:p>
@@ -169,13 +142,13 @@
                 <w:i w:val="0"/>
                 <w:sz w:val="18"/>
               </w:rPr>
-              <w:t>[email]</w:t>
+              <w:t>om.katole23@pccoepune.org</w:t>
             </w:r>
           </w:p>
         </w:tc>
         <w:tc>
           <w:tcPr>
-            <w:tcW w:type="dxa" w:w="2610"/>
+            <w:tcW w:type="dxa" w:w="3312"/>
           </w:tcPr>
           <w:p>
             <w:pPr>
@@ -188,20 +161,7 @@
                 <w:i w:val="0"/>
                 <w:sz w:val="22"/>
               </w:rPr>
-              <w:t>[Author 3]</w:t>
-            </w:r>
-          </w:p>
-          <w:p>
-            <w:pPr>
-              <w:jc w:val="center"/>
-            </w:pPr>
-            <w:r>
-              <w:rPr>
-                <w:rFonts w:ascii="Times New Roman" w:hAnsi="Times New Roman"/>
-                <w:i/>
-                <w:sz w:val="18"/>
-              </w:rPr>
-              <w:t>Dept. of [Department]</w:t>
+              <w:t>Satyam Kumar</w:t>
             </w:r>
           </w:p>
           <w:p>
@@ -240,13 +200,33 @@
                 <w:i w:val="0"/>
                 <w:sz w:val="18"/>
               </w:rPr>
-              <w:t>[email]</w:t>
+              <w:t>satyam.kumar23@pccoepune.org</w:t>
             </w:r>
           </w:p>
         </w:tc>
+      </w:tr>
+    </w:tbl>
+    <w:p>
+      <w:pPr>
+        <w:spacing w:after="120" w:before="0" w:line="240" w:lineRule="auto"/>
+        <w:ind w:firstLine="202"/>
+        <w:jc w:val="both"/>
+      </w:pPr>
+    </w:p>
+    <w:tbl>
+      <w:tblPr>
+        <w:tblW w:type="auto" w:w="0"/>
+        <w:jc w:val="center"/>
+        <w:tblLook w:firstColumn="1" w:firstRow="1" w:lastColumn="0" w:lastRow="0" w:noHBand="0" w:noVBand="1" w:val="04A0"/>
+      </w:tblPr>
+      <w:tblGrid>
+        <w:gridCol w:w="5220"/>
+        <w:gridCol w:w="5220"/>
+      </w:tblGrid>
+      <w:tr>
         <w:tc>
           <w:tcPr>
-            <w:tcW w:type="dxa" w:w="2610"/>
+            <w:tcW w:type="dxa" w:w="3312"/>
           </w:tcPr>
           <w:p>
             <w:pPr>
@@ -259,20 +239,7 @@
                 <w:i w:val="0"/>
                 <w:sz w:val="22"/>
               </w:rPr>
-              <w:t>[Author 4]</w:t>
-            </w:r>
-          </w:p>
-          <w:p>
-            <w:pPr>
-              <w:jc w:val="center"/>
-            </w:pPr>
-            <w:r>
-              <w:rPr>
-                <w:rFonts w:ascii="Times New Roman" w:hAnsi="Times New Roman"/>
-                <w:i/>
-                <w:sz w:val="18"/>
-              </w:rPr>
-              <w:t>Dept. of [Department]</w:t>
+              <w:t>Akshat Jhanwar</w:t>
             </w:r>
           </w:p>
           <w:p>
@@ -311,12 +278,77 @@
                 <w:i w:val="0"/>
                 <w:sz w:val="18"/>
               </w:rPr>
-              <w:t>[email]</w:t>
+              <w:t>akshat.jhanwar23@pccoepune.org</w:t>
+            </w:r>
+          </w:p>
+        </w:tc>
+        <w:tc>
+          <w:tcPr>
+            <w:tcW w:type="dxa" w:w="3312"/>
+          </w:tcPr>
+          <w:p>
+            <w:pPr>
+              <w:jc w:val="center"/>
+            </w:pPr>
+            <w:r/>
+            <w:r>
+              <w:rPr>
+                <w:rFonts w:ascii="Times New Roman" w:hAnsi="Times New Roman"/>
+                <w:i w:val="0"/>
+                <w:sz w:val="22"/>
+              </w:rPr>
+              <w:t>Minal Shahakar</w:t>
+            </w:r>
+          </w:p>
+          <w:p>
+            <w:pPr>
+              <w:jc w:val="center"/>
+            </w:pPr>
+            <w:r>
+              <w:rPr>
+                <w:rFonts w:ascii="Times New Roman" w:hAnsi="Times New Roman"/>
+                <w:i/>
+                <w:sz w:val="18"/>
+              </w:rPr>
+              <w:t>Pimpri Chinchwad College of Engineering</w:t>
+            </w:r>
+          </w:p>
+          <w:p>
+            <w:pPr>
+              <w:jc w:val="center"/>
+            </w:pPr>
+            <w:r>
+              <w:rPr>
+                <w:rFonts w:ascii="Times New Roman" w:hAnsi="Times New Roman"/>
+                <w:i/>
+                <w:sz w:val="18"/>
+              </w:rPr>
+              <w:t>Pune, India</w:t>
+            </w:r>
+          </w:p>
+          <w:p>
+            <w:pPr>
+              <w:jc w:val="center"/>
+            </w:pPr>
+            <w:r>
+              <w:rPr>
+                <w:rFonts w:ascii="Times New Roman" w:hAnsi="Times New Roman"/>
+                <w:i w:val="0"/>
+                <w:sz w:val="18"/>
+              </w:rPr>
+              <w:t>minal.shahakar@pccoepune.org</w:t>
             </w:r>
           </w:p>
         </w:tc>
       </w:tr>
     </w:tbl>
+    <w:p>
+      <w:pPr>
+        <w:spacing w:after="120" w:before="0" w:line="240" w:lineRule="auto"/>
+        <w:ind w:firstLine="202"/>
+        <w:jc w:val="both"/>
+      </w:pPr>
+    </w:p>
     <w:p>
       <w:pPr>
         <w:spacing w:after="200" w:before="0" w:line="240" w:lineRule="auto"/>
@@ -5060,7 +5092,7 @@
           <w:smallCaps w:val="0"/>
           <w:sz w:val="20"/>
         </w:rPr>
-        <w:t>The authors thank [Guide name] for guidance. This work was carried out for the MDM Digital Marketing Capstone (BCE27MD06) at Pimpri Chinchwad College of Engineering, Pune.</w:t>
+        <w:t>This work was carried out for the MDM Digital Marketing Capstone (BCE27MD06) at Pimpri Chinchwad College of Engineering, Pune, under the guidance of Minal Shahakar.</w:t>
       </w:r>
     </w:p>
     <w:p>

</xml_diff>